<commit_message>
Deploy preview for PR 65 🛫
</commit_message>
<xml_diff>
--- a/pr-preview/pr-65/Your-Book-Title-tracked-changes.docx
+++ b/pr-preview/pr-65/Your-Book-Title-tracked-changes.docx
@@ -2232,7 +2232,7 @@
           <w:numId w:val="1004"/>
         </w:numPr>
       </w:pPr>
-      <w:ins w:id="79" w:author="d-morrison" w:date="2026-09-15T06:45:54Z">
+      <w:ins w:id="79" w:author="d-morrison" w:date="2026-09-15T06:55:07Z">
         <w:r>
           <w:rPr>
             <w:b/>
@@ -2241,12 +2241,12 @@
           <w:t xml:space="preserve">Branch:</w:t>
         </w:r>
       </w:ins>
-      <w:ins w:id="79" w:author="d-morrison" w:date="2026-09-15T06:45:54Z">
+      <w:ins w:id="79" w:author="d-morrison" w:date="2026-09-15T06:55:07Z">
         <w:r>
           <w:t xml:space="preserve"> </w:t>
         </w:r>
       </w:ins>
-      <w:ins w:id="79" w:author="d-morrison" w:date="2026-09-15T06:45:54Z">
+      <w:ins w:id="79" w:author="d-morrison" w:date="2026-09-15T06:55:07Z">
         <w:r>
           <w:t xml:space="preserve">claude/fix-62-preview-concurrency</w:t>
         </w:r>
@@ -2260,7 +2260,7 @@
           <w:numId w:val="1004"/>
         </w:numPr>
       </w:pPr>
-      <w:ins w:id="80" w:author="d-morrison" w:date="2026-09-15T06:45:54Z">
+      <w:ins w:id="80" w:author="d-morrison" w:date="2026-09-15T06:55:07Z">
         <w:r>
           <w:rPr>
             <w:b/>
@@ -2269,14 +2269,14 @@
           <w:t xml:space="preserve">Commit:</w:t>
         </w:r>
       </w:ins>
-      <w:ins w:id="80" w:author="d-morrison" w:date="2026-09-15T06:45:54Z">
+      <w:ins w:id="80" w:author="d-morrison" w:date="2026-09-15T06:55:07Z">
         <w:r>
           <w:t xml:space="preserve"> </w:t>
         </w:r>
       </w:ins>
-      <w:ins w:id="80" w:author="d-morrison" w:date="2026-09-15T06:45:54Z">
+      <w:ins w:id="80" w:author="d-morrison" w:date="2026-09-15T06:55:07Z">
         <w:r>
-          <w:t xml:space="preserve">19a81ea</w:t>
+          <w:t xml:space="preserve">50326e9</w:t>
         </w:r>
       </w:ins>
     </w:p>
@@ -2288,7 +2288,7 @@
           <w:numId w:val="1004"/>
         </w:numPr>
       </w:pPr>
-      <w:ins w:id="81" w:author="d-morrison" w:date="2026-09-15T06:45:54Z">
+      <w:ins w:id="81" w:author="d-morrison" w:date="2026-09-15T06:55:07Z">
         <w:r>
           <w:rPr>
             <w:b/>
@@ -2297,14 +2297,14 @@
           <w:t xml:space="preserve">Full commit hash:</w:t>
         </w:r>
       </w:ins>
-      <w:ins w:id="81" w:author="d-morrison" w:date="2026-09-15T06:45:54Z">
+      <w:ins w:id="81" w:author="d-morrison" w:date="2026-09-15T06:55:07Z">
         <w:r>
           <w:t xml:space="preserve"> </w:t>
         </w:r>
       </w:ins>
-      <w:ins w:id="81" w:author="d-morrison" w:date="2026-09-15T06:45:54Z">
+      <w:ins w:id="81" w:author="d-morrison" w:date="2026-09-15T06:55:07Z">
         <w:r>
-          <w:t xml:space="preserve">19a81ea29fcbc4ad1dcd2d7bea2296096680495c</w:t>
+          <w:t xml:space="preserve">50326e9ae3d5721cc5ea706f6aea4522891dc98d</w:t>
         </w:r>
       </w:ins>
     </w:p>
@@ -2316,7 +2316,7 @@
           <w:numId w:val="1004"/>
         </w:numPr>
       </w:pPr>
-      <w:ins w:id="82" w:author="d-morrison" w:date="2026-09-15T06:45:54Z">
+      <w:ins w:id="82" w:author="d-morrison" w:date="2026-09-15T06:55:07Z">
         <w:r>
           <w:rPr>
             <w:b/>
@@ -2325,14 +2325,14 @@
           <w:t xml:space="preserve">Commit date:</w:t>
         </w:r>
       </w:ins>
-      <w:ins w:id="82" w:author="d-morrison" w:date="2026-09-15T06:45:54Z">
+      <w:ins w:id="82" w:author="d-morrison" w:date="2026-09-15T06:55:07Z">
         <w:r>
           <w:t xml:space="preserve"> </w:t>
         </w:r>
       </w:ins>
-      <w:ins w:id="82" w:author="d-morrison" w:date="2026-09-15T06:45:54Z">
+      <w:ins w:id="82" w:author="d-morrison" w:date="2026-09-15T06:55:07Z">
         <w:r>
-          <w:t xml:space="preserve">2026-09-15 06:43:15 +0000</w:t>
+          <w:t xml:space="preserve">2026-09-15 06:52:22 +0000</w:t>
         </w:r>
       </w:ins>
     </w:p>

</xml_diff>